<commit_message>
Expand capstone teaching solution with construction reasoning and angle diagrams
</commit_message>
<xml_diff>
--- a/materials/grade8_extra/extra_teacher.docx
+++ b/materials/grade8_extra/extra_teacher.docx
@@ -7,7 +7,7 @@
         <w:pStyle w:val="Title"/>
       </w:pPr>
       <w:r>
-        <w:t>中等题与综合压轴题：教师说明</w:t>
+        <w:t>两道补充题：逐步配图教师详解</w:t>
       </w:r>
     </w:p>
     <w:p>
@@ -15,12 +15,12 @@
         <w:pStyle w:val="Heading2"/>
       </w:pPr>
       <w:r>
-        <w:t>为什么这两题分档</w:t>
+        <w:t>本次修订了什么</w:t>
       </w:r>
     </w:p>
     <w:p>
       <w:r>
-        <w:t>题1只需一次SAS识别BD=CF，再按D的位置作加减，作为中等题。题2前两问需要主动倍长BF，把AD的中点转换为BH的中点，再用中点连线和平行线找到等腰结构；第三问要放弃机械沿用H，另构造T，并连续识别两个等边三角形和一个等腰三角形。按辅助线层数和末问迁移要求，题2与原卷24题的中点构造、25题的特殊三角形综合要求相近。</w:t>
+        <w:t>原版把前两问的对应角、第三问的辅助点动机写得过快。本版把三问拆成12个图文步骤，并增加两页中点引理；一个关键结论占一页，射线方向和角的来源单独解释。学生题面、选题和分值保持一致。</w:t>
       </w:r>
     </w:p>
     <w:p>
@@ -28,12 +28,12 @@
         <w:pStyle w:val="Heading2"/>
       </w:pPr>
       <w:r>
-        <w:t>知识范围</w:t>
+        <w:t>两题的定位与安排</w:t>
       </w:r>
     </w:p>
     <w:p>
       <w:r>
-        <w:t>全等SAS、等腰与等边三角形、平行线角关系、中点性质。两题均不需要勾股定理、根式运算、相似、圆或函数。中点连线的平行性质若尚未学，可先给出，并用附录的两次SAS补证；不要将未学过性质直接判为能力不足。</w:t>
+        <w:t>题1是中等题，建议10—12分钟；题2是综合压轴题，建议25—35分钟。两题独立完成约40—45分钟，再用约45分钟讲解，余下时间用于批改、追问和遮住答案后重建辅助线。</w:t>
       </w:r>
     </w:p>
     <w:p>
@@ -41,12 +41,12 @@
         <w:pStyle w:val="Heading2"/>
       </w:pPr>
       <w:r>
-        <w:t>两小时的一种安排</w:t>
+        <w:t>先备知识</w:t>
       </w:r>
     </w:p>
     <w:p>
       <w:r>
-        <w:t>独立完成两题40—45分钟；批改与追问10分钟；重点讲解40—45分钟；遮住原解重建关键辅助线15分钟；最后5分钟复述。若与前四题混用，应替换其中一部分，不能把六道综合题都按原50分钟塞进去。</w:t>
+        <w:t>全等SAS、平行线与角、等腰和等边三角形、中点。若中点连线性质尚未学，先看本版两页引理；证明只用两次SAS，无需相似、勾股定理或根式。</w:t>
       </w:r>
     </w:p>
     <w:p>
@@ -54,14 +54,12 @@
         <w:pStyle w:val="Heading2"/>
       </w:pPr>
       <w:r>
-        <w:t>本次答案与评分</w:t>
+        <w:t>答案与评分</w:t>
       </w:r>
     </w:p>
     <w:p>
       <w:r>
-        <w:t>题1：（1）BC=CF+CD；（2）BC=CF-CD。各6分：全等条件3分、CF=BD及结论3分。</w:t>
-        <w:br/>
-        <w:t>题2：（1）∠BME=∠CNE；（2）OM=ON，△OMN为等腰三角形；（3）∠AGD=90°，∠ADG=30°。第（1）（2）问各6分；末问12分，建议构造T并得到F为TC中点4分、证明△TAB等边2分、证明△AGF等边2分、等腰△GFD角度与直角结论4分。</w:t>
+        <w:t>题1：（1）BC=CF+CD；（2）BC=CF-CD，各6分。题2：（1）∠BME=∠CNE，6分；（2）OM=ON，6分；（3）△AGD直角，直角在G，12分。第三问建议：构造T及中点4分、△TAB等边2分、△AGF等边2分、等腰角度与直角结论4分。</w:t>
       </w:r>
     </w:p>
     <w:p>
@@ -69,12 +67,12 @@
         <w:pStyle w:val="Heading2"/>
       </w:pPr>
       <w:r>
-        <w:t>出处说明</w:t>
+        <w:t>来源与文件</w:t>
       </w:r>
     </w:p>
     <w:p>
       <w:r>
-        <w:t>题1取公开题库T22-A01-08的前两问，题2取公开讲义习题6.25.11完整三问。原图、原文摘录、固定版本链接与许可随包保存；图b中O已在原图标出，本次按原图补写交点定义，并明确M、N、O互异，保持原图所示的非退化三角形情形。下面各步骤图是独立重绘的教学图。</w:t>
+        <w:t>原题、原图与固定版本出处保留在README及sources。本版图形为独立教学重绘。除这份完整教师版，另提供只含三问压轴题的challenge_detailed.pdf、Word和在线图文版，便于手机阅读。</w:t>
       </w:r>
     </w:p>
     <w:p>
@@ -84,23 +82,15 @@
     </w:p>
     <w:p>
       <w:pPr>
-        <w:pStyle w:val="Title"/>
-      </w:pPr>
-      <w:r>
-        <w:t>题1：中等题</w:t>
-      </w:r>
-    </w:p>
-    <w:p>
-      <w:pPr>
         <w:pStyle w:val="Heading1"/>
       </w:pPr>
       <w:r>
-        <w:t>（1）旋转全等，再把BD拆成两段</w:t>
+        <w:t>题1｜（1）旋转全等，再把BD拆成两段</w:t>
       </w:r>
     </w:p>
     <w:p>
       <w:r>
-        <w:t>作图：连接CF，比较△BAD与△CAF。</w:t>
+        <w:t>连接CF，比较△BAD与△CAF。</w:t>
       </w:r>
     </w:p>
     <w:p>
@@ -154,7 +144,7 @@
     </w:p>
     <w:p>
       <w:r>
-        <w:t>本步结论：BC=CF+CD。</w:t>
+        <w:t>结论：BC=CF+CD。</w:t>
       </w:r>
     </w:p>
     <w:p>
@@ -164,23 +154,15 @@
     </w:p>
     <w:p>
       <w:pPr>
-        <w:pStyle w:val="Title"/>
-      </w:pPr>
-      <w:r>
-        <w:t>题1：中等题</w:t>
-      </w:r>
-    </w:p>
-    <w:p>
-      <w:pPr>
         <w:pStyle w:val="Heading1"/>
       </w:pPr>
       <w:r>
-        <w:t>（2）同样全等，点的位置改用减法</w:t>
+        <w:t>题1｜（2）同样全等，点的位置改用减法</w:t>
       </w:r>
     </w:p>
     <w:p>
       <w:r>
-        <w:t>作图：D移到BC越过C的延长线上，仍比较同一组三角形。</w:t>
+        <w:t>D移到BC越过C的延长线上，仍比较同一组三角形。</w:t>
       </w:r>
     </w:p>
     <w:p>
@@ -234,7 +216,7 @@
     </w:p>
     <w:p>
       <w:r>
-        <w:t>本步结论：BC=CF-CD。</w:t>
+        <w:t>结论：BC=CF-CD。</w:t>
       </w:r>
     </w:p>
     <w:p>
@@ -244,30 +226,26 @@
     </w:p>
     <w:p>
       <w:pPr>
-        <w:pStyle w:val="Title"/>
-      </w:pPr>
-      <w:r>
-        <w:t>题2（1）：中点制造等腰三角形</w:t>
-      </w:r>
-    </w:p>
-    <w:p>
-      <w:pPr>
         <w:pStyle w:val="Heading1"/>
       </w:pPr>
       <w:r>
-        <w:t>第1步：延长BF，把F变成第二条线段的中点</w:t>
+        <w:t>三问压轴题｜题面与读图</w:t>
       </w:r>
     </w:p>
     <w:p>
       <w:r>
-        <w:t>作图：延长BF过F到H，使FH=FB；连接DH、CH。</w:t>
+        <w:t>（1）如图a，在四边形ABCD中，AB=CD，E、F分别是BC、AD的中点。直线EF与BA、CD的延长线分别交于M、N。求证：∠BME=∠CNE。</w:t>
+        <w:br/>
+        <w:t>（2）如图b，在四边形ADBC中，AB=CD，E、F分别是BC、AD的中点。AB与CD交于O，直线EF与DC、AB分别交于M、N，M、N、O互不重合。判断△OMN的形状，并证明。</w:t>
+        <w:br/>
+        <w:t>（3）如图c，在△ABC中，AC&gt;AB，D在AC上，且AB=CD。E、F分别为BC、AD的中点，直线EF与BA的延长线交于G。若∠EFC=60°，连接GD，判断△AGD的形状，并证明。</w:t>
       </w:r>
     </w:p>
     <w:p>
       <w:r>
         <w:drawing>
           <wp:inline xmlns:a="http://schemas.openxmlformats.org/drawingml/2006/main" xmlns:pic="http://schemas.openxmlformats.org/drawingml/2006/picture">
-            <wp:extent cx="3780000" cy="3198462"/>
+            <wp:extent cx="5760000" cy="1715868"/>
             <wp:docPr id="3" name="Picture 3"/>
             <wp:cNvGraphicFramePr>
               <a:graphicFrameLocks noChangeAspect="1"/>
@@ -276,7 +254,7 @@
               <a:graphicData uri="http://schemas.openxmlformats.org/drawingml/2006/picture">
                 <pic:pic>
                   <pic:nvPicPr>
-                    <pic:cNvPr id="0" name="h1_sas.png"/>
+                    <pic:cNvPr id="0" name="challenge_630.png"/>
                     <pic:cNvPicPr/>
                   </pic:nvPicPr>
                   <pic:blipFill>
@@ -288,7 +266,7 @@
                   <pic:spPr>
                     <a:xfrm>
                       <a:off x="0" y="0"/>
-                      <a:ext cx="3780000" cy="3198462"/>
+                      <a:ext cx="5760000" cy="1715868"/>
                     </a:xfrm>
                     <a:prstGeom prst="rect"/>
                   </pic:spPr>
@@ -301,33 +279,7 @@
     </w:p>
     <w:p>
       <w:r>
-        <w:t>AF=DF（原有中点）。</w:t>
-        <w:br/>
-        <w:t>BF=FH（新构造）。</w:t>
-        <w:br/>
-        <w:t>∠AFB=∠DFH（对顶角）。</w:t>
-        <w:br/>
-        <w:t>所以△AFB≌△DFH（SAS）。</w:t>
-        <w:br/>
-        <w:t>得到DH=AB，且由对应角得DH∥AB。</w:t>
-      </w:r>
-    </w:p>
-    <w:p>
-      <w:r>
-        <w:t>本步结论：DH=AB=CD，DH∥AB；F是BH中点。</w:t>
-      </w:r>
-    </w:p>
-    <w:p>
-      <w:r>
         <w:br w:type="page"/>
-      </w:r>
-    </w:p>
-    <w:p>
-      <w:pPr>
-        <w:pStyle w:val="Title"/>
-      </w:pPr>
-      <w:r>
-        <w:t>题2（1）：中点制造等腰三角形</w:t>
       </w:r>
     </w:p>
     <w:p>
@@ -335,19 +287,19 @@
         <w:pStyle w:val="Heading1"/>
       </w:pPr>
       <w:r>
-        <w:t>第2步：中点给平行，等腰给等角</w:t>
+        <w:t>先备知识｜引理第1步：把中点条件变成全等条件</w:t>
       </w:r>
     </w:p>
     <w:p>
       <w:r>
-        <w:t>作图：单独突出△BHC的中点连线EF和等腰△DHC。</w:t>
+        <w:t>为什么这样想：后三问都要用“连接两边中点的线段平行于第三边”。若尚未学过，先用全等证明；本页和下一页合起来就是完整证明。</w:t>
       </w:r>
     </w:p>
     <w:p>
       <w:r>
         <w:drawing>
           <wp:inline xmlns:a="http://schemas.openxmlformats.org/drawingml/2006/main" xmlns:pic="http://schemas.openxmlformats.org/drawingml/2006/picture">
-            <wp:extent cx="3780000" cy="3198462"/>
+            <wp:extent cx="3888000" cy="3289846"/>
             <wp:docPr id="4" name="Picture 4"/>
             <wp:cNvGraphicFramePr>
               <a:graphicFrameLocks noChangeAspect="1"/>
@@ -356,7 +308,7 @@
               <a:graphicData uri="http://schemas.openxmlformats.org/drawingml/2006/picture">
                 <pic:pic>
                   <pic:nvPicPr>
-                    <pic:cNvPr id="0" name="h1_iso.png"/>
+                    <pic:cNvPr id="0" name="lemma_sas.png"/>
                     <pic:cNvPicPr/>
                   </pic:nvPicPr>
                   <pic:blipFill>
@@ -368,7 +320,7 @@
                   <pic:spPr>
                     <a:xfrm>
                       <a:off x="0" y="0"/>
-                      <a:ext cx="3780000" cy="3198462"/>
+                      <a:ext cx="3888000" cy="3289846"/>
                     </a:xfrm>
                     <a:prstGeom prst="rect"/>
                   </pic:spPr>
@@ -381,18 +333,32 @@
     </w:p>
     <w:p>
       <w:r>
-        <w:t>在△BHC中，E是BC中点，F是BH中点，故EF∥CH。</w:t>
-        <w:br/>
-        <w:t>DH=CD，所以△DHC为等腰三角形，∠DHC=∠DCH。</w:t>
-        <w:br/>
-        <w:t>AB∥DH，EF∥CH，且C、D、N共线。</w:t>
-        <w:br/>
-        <w:t>因此∠BME=∠DHC，∠CNE=∠DCH。</w:t>
+        <w:t>看图／作图：在△TUV中，X、Y分别为TU、TV中点。延长XY过Y至Z，使YZ=YX；连接VZ、UZ。</w:t>
       </w:r>
     </w:p>
     <w:p>
       <w:r>
-        <w:t>本步结论：∠BME=∠CNE。</w:t>
+        <w:t>① TY=YV（Y是TV中点），YX=YZ（作图）。</w:t>
+        <w:br/>
+        <w:t>② ∠TYX=∠VYZ（对顶角）。</w:t>
+        <w:br/>
+        <w:t>③ 所以△TYX≌△VYZ（SAS）。</w:t>
+        <w:br/>
+        <w:t>④ 对应边相等，得TX=VZ；又TX=XU，故XU=VZ。</w:t>
+        <w:br/>
+        <w:t>⑤ 对应角∠TXY=∠VZY；它们是内错角，故TX∥VZ。</w:t>
+        <w:br/>
+        <w:t>⑥ T、X、U共线，因此XU∥VZ。</w:t>
+      </w:r>
+    </w:p>
+    <w:p>
+      <w:r>
+        <w:t>本页结论：得到一组平行且相等的线段：XU∥VZ，XU=VZ。</w:t>
+      </w:r>
+    </w:p>
+    <w:p>
+      <w:r>
+        <w:t>讲解提醒：本页只做准备：还没有证明XY∥UV，要继续看第二次全等。</w:t>
       </w:r>
     </w:p>
     <w:p>
@@ -402,30 +368,22 @@
     </w:p>
     <w:p>
       <w:pPr>
-        <w:pStyle w:val="Title"/>
-      </w:pPr>
-      <w:r>
-        <w:t>题2（2）：换位置，重新识别对应角</w:t>
-      </w:r>
-    </w:p>
-    <w:p>
-      <w:pPr>
         <w:pStyle w:val="Heading1"/>
       </w:pPr>
       <w:r>
-        <w:t>第1步：把第（1）问的辅助构造迁移过来</w:t>
+        <w:t>先备知识｜引理第2步：再用一次SAS，得到平行</w:t>
       </w:r>
     </w:p>
     <w:p>
       <w:r>
-        <w:t>作图：仍延长BF至H，使FH=FB；连接DH、CH。</w:t>
+        <w:t>为什么这样想：上页已把XU与VZ变成平行且相等的一组边。连接UZ后，再比较共用UZ的两个三角形。</w:t>
       </w:r>
     </w:p>
     <w:p>
       <w:r>
         <w:drawing>
           <wp:inline xmlns:a="http://schemas.openxmlformats.org/drawingml/2006/main" xmlns:pic="http://schemas.openxmlformats.org/drawingml/2006/picture">
-            <wp:extent cx="3780000" cy="3198462"/>
+            <wp:extent cx="3888000" cy="3289846"/>
             <wp:docPr id="5" name="Picture 5"/>
             <wp:cNvGraphicFramePr>
               <a:graphicFrameLocks noChangeAspect="1"/>
@@ -434,7 +392,7 @@
               <a:graphicData uri="http://schemas.openxmlformats.org/drawingml/2006/picture">
                 <pic:pic>
                   <pic:nvPicPr>
-                    <pic:cNvPr id="0" name="h2_sas.png"/>
+                    <pic:cNvPr id="0" name="lemma_parallel.png"/>
                     <pic:cNvPicPr/>
                   </pic:nvPicPr>
                   <pic:blipFill>
@@ -446,7 +404,7 @@
                   <pic:spPr>
                     <a:xfrm>
                       <a:off x="0" y="0"/>
-                      <a:ext cx="3780000" cy="3198462"/>
+                      <a:ext cx="3888000" cy="3289846"/>
                     </a:xfrm>
                     <a:prstGeom prst="rect"/>
                   </pic:spPr>
@@ -459,16 +417,32 @@
     </w:p>
     <w:p>
       <w:r>
-        <w:t>原图位置变了，但AF=DF、BF=FH及对顶角仍成立。</w:t>
-        <w:br/>
-        <w:t>所以△AFB≌△DFH（SAS），DH=AB=CD，DH∥AB。</w:t>
-        <w:br/>
-        <w:t>E是BC中点，F是BH中点，仍有EF∥CH。</w:t>
+        <w:t>看图／作图：突出△XUZ、△VZU；UZ是公共边。</w:t>
       </w:r>
     </w:p>
     <w:p>
       <w:r>
-        <w:t>本步结论：△DHC等腰，且MN∥HC，AB∥DH。</w:t>
+        <w:t>① XU=VZ（上页），UZ=ZU（公共边）。</w:t>
+        <w:br/>
+        <w:t>② XU∥VZ，故∠XUZ=∠VZU（内错角）。</w:t>
+        <w:br/>
+        <w:t>③ 所以△XUZ≌△VZU（SAS）。</w:t>
+        <w:br/>
+        <w:t>④ 得∠XZU=∠VUZ（对应角）。</w:t>
+        <w:br/>
+        <w:t>⑤ 这两个角是直线XZ、UV被UZ所截的内错角，故XZ∥UV。</w:t>
+        <w:br/>
+        <w:t>⑥ X、Y、Z共线，所以XY∥UV。</w:t>
+      </w:r>
+    </w:p>
+    <w:p>
+      <w:r>
+        <w:t>本页结论：三角形两边中点的连线平行于第三边；下文简称“中点连线性质”。</w:t>
+      </w:r>
+    </w:p>
+    <w:p>
+      <w:r>
+        <w:t>讲解提醒：对应到后文：先找到一个三角形，再说明两个点分别是哪两条边的中点。</w:t>
       </w:r>
     </w:p>
     <w:p>
@@ -478,30 +452,22 @@
     </w:p>
     <w:p>
       <w:pPr>
-        <w:pStyle w:val="Title"/>
-      </w:pPr>
-      <w:r>
-        <w:t>题2（2）：换位置，重新识别对应角</w:t>
-      </w:r>
-    </w:p>
-    <w:p>
-      <w:pPr>
         <w:pStyle w:val="Heading1"/>
       </w:pPr>
       <w:r>
-        <w:t>第2步：先找大三角形里的两个相等角</w:t>
+        <w:t>第（1）问｜第1步：为什么要倍长BF？</w:t>
       </w:r>
     </w:p>
     <w:p>
       <w:r>
-        <w:t>作图：突出△DHC，并把MN所在直线与CH作对照。</w:t>
+        <w:t>为什么这样想：AB=CD，但这两条边还没在同一个三角形里。想把AB复制到D处；F又是AD中点，所以尝试以F为中心作一组全等三角形。</w:t>
       </w:r>
     </w:p>
     <w:p>
       <w:r>
         <w:drawing>
           <wp:inline xmlns:a="http://schemas.openxmlformats.org/drawingml/2006/main" xmlns:pic="http://schemas.openxmlformats.org/drawingml/2006/picture">
-            <wp:extent cx="3780000" cy="3198462"/>
+            <wp:extent cx="3888000" cy="3289846"/>
             <wp:docPr id="6" name="Picture 6"/>
             <wp:cNvGraphicFramePr>
               <a:graphicFrameLocks noChangeAspect="1"/>
@@ -510,7 +476,7 @@
               <a:graphicData uri="http://schemas.openxmlformats.org/drawingml/2006/picture">
                 <pic:pic>
                   <pic:nvPicPr>
-                    <pic:cNvPr id="0" name="h2_iso.png"/>
+                    <pic:cNvPr id="0" name="h1_sas.png"/>
                     <pic:cNvPicPr/>
                   </pic:nvPicPr>
                   <pic:blipFill>
@@ -522,7 +488,7 @@
                   <pic:spPr>
                     <a:xfrm>
                       <a:off x="0" y="0"/>
-                      <a:ext cx="3780000" cy="3198462"/>
+                      <a:ext cx="3888000" cy="3289846"/>
                     </a:xfrm>
                     <a:prstGeom prst="rect"/>
                   </pic:spPr>
@@ -535,16 +501,32 @@
     </w:p>
     <w:p>
       <w:r>
-        <w:t>DH=DC，所以∠DHC=∠DCH。</w:t>
-        <w:br/>
-        <w:t>图b中O、N在直线AB上，O、M在直线CD上。</w:t>
-        <w:br/>
-        <w:t>利用AB∥DH、MN∥HC，可将△OMN的两个底角分别对应到△DHC的两个底角。</w:t>
+        <w:t>看图／作图：连接BF，延长BF过F至H，使FH=FB；连接DH、CH。</w:t>
       </w:r>
     </w:p>
     <w:p>
       <w:r>
-        <w:t>本步结论：∠OMN=∠DCH，∠ONM=∠DHC。</w:t>
+        <w:t>① AF=DF（F是AD中点），BF=FH（作图）。</w:t>
+        <w:br/>
+        <w:t>② A、F、D共线，B、F、H共线，故∠AFB=∠DFH。</w:t>
+        <w:br/>
+        <w:t>③ △AFB≌△DFH（SAS），对应为A↔D、F↔F、B↔H。</w:t>
+        <w:br/>
+        <w:t>④ 所以DH=AB；结合AB=CD，得DH=CD。</w:t>
+        <w:br/>
+        <w:t>⑤ 还得到∠ABF=∠DHF（对应角）。</w:t>
+        <w:br/>
+        <w:t>⑥ 这是一组内错角，故AB∥DH。</w:t>
+      </w:r>
+    </w:p>
+    <w:p>
+      <w:r>
+        <w:t>本页结论：DH=CD，AB∥DH；同时B、F、H共线且BF=FH。</w:t>
+      </w:r>
+    </w:p>
+    <w:p>
+      <w:r>
+        <w:t>讲解提醒：辅助点H做了两件事：复制AB，并让F成为BH的中点。</w:t>
       </w:r>
     </w:p>
     <w:p>
@@ -554,30 +536,22 @@
     </w:p>
     <w:p>
       <w:pPr>
-        <w:pStyle w:val="Title"/>
-      </w:pPr>
-      <w:r>
-        <w:t>题2（2）：换位置，重新识别对应角</w:t>
-      </w:r>
-    </w:p>
-    <w:p>
-      <w:pPr>
         <w:pStyle w:val="Heading1"/>
       </w:pPr>
       <w:r>
-        <w:t>第3步：放大看△OMN，写出形状</w:t>
+        <w:t>第（1）问｜第2步：两个中点落在哪个三角形里？</w:t>
       </w:r>
     </w:p>
     <w:p>
       <w:r>
-        <w:t>作图：放大△OMN，标出M、N处的相等角。</w:t>
+        <w:t>为什么这样想：E原本就是BC中点；上一步又得到F是BH中点。两条线段BC、BH共同属于△BHC，所以应当看这个大三角形。</w:t>
       </w:r>
     </w:p>
     <w:p>
       <w:r>
         <w:drawing>
           <wp:inline xmlns:a="http://schemas.openxmlformats.org/drawingml/2006/main" xmlns:pic="http://schemas.openxmlformats.org/drawingml/2006/picture">
-            <wp:extent cx="3780000" cy="3198462"/>
+            <wp:extent cx="3888000" cy="3289846"/>
             <wp:docPr id="7" name="Picture 7"/>
             <wp:cNvGraphicFramePr>
               <a:graphicFrameLocks noChangeAspect="1"/>
@@ -586,7 +560,7 @@
               <a:graphicData uri="http://schemas.openxmlformats.org/drawingml/2006/picture">
                 <pic:pic>
                   <pic:nvPicPr>
-                    <pic:cNvPr id="0" name="h2_result.png"/>
+                    <pic:cNvPr id="0" name="h1_mid.png"/>
                     <pic:cNvPicPr/>
                   </pic:nvPicPr>
                   <pic:blipFill>
@@ -598,7 +572,7 @@
                   <pic:spPr>
                     <a:xfrm>
                       <a:off x="0" y="0"/>
-                      <a:ext cx="3780000" cy="3198462"/>
+                      <a:ext cx="3888000" cy="3289846"/>
                     </a:xfrm>
                     <a:prstGeom prst="rect"/>
                   </pic:spPr>
@@ -611,20 +585,32 @@
     </w:p>
     <w:p>
       <w:r>
-        <w:t>∠OMN=∠DCH，</w:t>
-        <w:br/>
-        <w:t>∠ONM=∠DHC。</w:t>
-        <w:br/>
-        <w:t>而∠DCH=∠DHC，</w:t>
-        <w:br/>
-        <w:t>所以∠OMN=∠ONM。</w:t>
-        <w:br/>
-        <w:t>等角对等边，得到OM=ON。</w:t>
+        <w:t>看图／作图：突出△BHC及其中的EF；另用蓝色突出等腰△DHC。</w:t>
       </w:r>
     </w:p>
     <w:p>
       <w:r>
-        <w:t>本步结论：△OMN是等腰三角形，OM=ON；顶角度数不固定。</w:t>
+        <w:t>① 在△BHC中，BE=EC，故E是BC中点。</w:t>
+        <w:br/>
+        <w:t>② B、F、H共线且BF=FH，故F是BH中点。</w:t>
+        <w:br/>
+        <w:t>③ 由中点连线性质，EF∥CH。</w:t>
+        <w:br/>
+        <w:t>④ 由上页DH=CD，△DHC是等腰三角形，底边为HC。</w:t>
+        <w:br/>
+        <w:t>⑤ 因而两个底角相等：∠DHC=∠DCH。</w:t>
+        <w:br/>
+        <w:t>⑥ 现在已知AB∥DH、EF∥CH，下一步把目标角对应过来。</w:t>
+      </w:r>
+    </w:p>
+    <w:p>
+      <w:r>
+        <w:t>本页结论：先在等腰△DHC中得到∠DHC=∠DCH，再去找原题的角。</w:t>
+      </w:r>
+    </w:p>
+    <w:p>
+      <w:r>
+        <w:t>讲解提醒：等腰三角形的顶点是D，两个相等的角在H、C。</w:t>
       </w:r>
     </w:p>
     <w:p>
@@ -634,30 +620,22 @@
     </w:p>
     <w:p>
       <w:pPr>
-        <w:pStyle w:val="Title"/>
-      </w:pPr>
-      <w:r>
-        <w:t>题2（3）：末问需要新的辅助点</w:t>
-      </w:r>
-    </w:p>
-    <w:p>
-      <w:pPr>
         <w:pStyle w:val="Heading1"/>
       </w:pPr>
       <w:r>
-        <w:t>第1步：在CA延长线上复制CD</w:t>
+        <w:t>第（1）问｜第3步：把两组对应角分别画出来</w:t>
       </w:r>
     </w:p>
     <w:p>
       <w:r>
-        <w:t>作图：延长CA过A到T，使AT=CD（=AB），连接TB。</w:t>
+        <w:t>为什么这样想：“两组线分别平行”本身还不够，角也可能互补。要检查组成角的两条射线是同向还是反向；两条射线同时反向，角度保持不变。</w:t>
       </w:r>
     </w:p>
     <w:p>
       <w:r>
         <w:drawing>
           <wp:inline xmlns:a="http://schemas.openxmlformats.org/drawingml/2006/main" xmlns:pic="http://schemas.openxmlformats.org/drawingml/2006/picture">
-            <wp:extent cx="3780000" cy="3198462"/>
+            <wp:extent cx="3888000" cy="3289846"/>
             <wp:docPr id="8" name="Picture 8"/>
             <wp:cNvGraphicFramePr>
               <a:graphicFrameLocks noChangeAspect="1"/>
@@ -666,7 +644,7 @@
               <a:graphicData uri="http://schemas.openxmlformats.org/drawingml/2006/picture">
                 <pic:pic>
                   <pic:nvPicPr>
-                    <pic:cNvPr id="0" name="h3_mid.png"/>
+                    <pic:cNvPr id="0" name="h1_angles.png"/>
                     <pic:cNvPicPr/>
                   </pic:nvPicPr>
                   <pic:blipFill>
@@ -678,7 +656,7 @@
                   <pic:spPr>
                     <a:xfrm>
                       <a:off x="0" y="0"/>
-                      <a:ext cx="3780000" cy="3198462"/>
+                      <a:ext cx="3888000" cy="3289846"/>
                     </a:xfrm>
                     <a:prstGeom prst="rect"/>
                   </pic:spPr>
@@ -691,18 +669,32 @@
     </w:p>
     <w:p>
       <w:r>
-        <w:t>A、F、D、C依次共线，AF=FD。</w:t>
-        <w:br/>
-        <w:t>TF=TA+AF；FC=FD+DC。</w:t>
-        <w:br/>
-        <w:t>因为TA=DC，所以TF=FC，F恰为TC中点。</w:t>
-        <w:br/>
-        <w:t>E是BC中点，于是△TBC中EF是中点连线，EF∥TB。</w:t>
+        <w:t>看图／作图：上排对照M、H处的角；下排对照N、C处的角。箭头表示射线方向，同色弧表示待比较的角。</w:t>
       </w:r>
     </w:p>
     <w:p>
       <w:r>
-        <w:t>本步结论：新的辅助点T使EF∥TB，且AT=AB。</w:t>
+        <w:t>① 在图a的位置中，射线MB与HD平行且同向，ME与HC也平行且同向。</w:t>
+        <w:br/>
+        <w:t xml:space="preserve">   所以∠BME=∠DHC（上排两个角）。</w:t>
+        <w:br/>
+        <w:t>② 射线NC与CD平行且反向，NE与CH也平行且反向。</w:t>
+        <w:br/>
+        <w:t xml:space="preserve">   相当于把整个角转过180°，所以∠CNE=∠DCH（下排两个角）。</w:t>
+        <w:br/>
+        <w:t>③ 上页已证∠DHC=∠DCH。</w:t>
+        <w:br/>
+        <w:t>④ 连起来：∠BME=∠DHC=∠DCH=∠CNE。</w:t>
+      </w:r>
+    </w:p>
+    <w:p>
+      <w:r>
+        <w:t>本页结论：∠BME=∠CNE，第（1）问得证。</w:t>
+      </w:r>
+    </w:p>
+    <w:p>
+      <w:r>
+        <w:t>讲解提醒：不能把“CD与NC共线”直接写成同向；这里它们实际反向。</w:t>
       </w:r>
     </w:p>
     <w:p>
@@ -712,30 +704,22 @@
     </w:p>
     <w:p>
       <w:pPr>
-        <w:pStyle w:val="Title"/>
-      </w:pPr>
-      <w:r>
-        <w:t>题2（3）：末问需要新的辅助点</w:t>
-      </w:r>
-    </w:p>
-    <w:p>
-      <w:pPr>
         <w:pStyle w:val="Heading1"/>
       </w:pPr>
       <w:r>
-        <w:t>第2步：60°条件使△TAB变为等边</w:t>
+        <w:t>第（2）问｜第1步：位置变了，哪些结论仍成立？</w:t>
       </w:r>
     </w:p>
     <w:p>
       <w:r>
-        <w:t>作图：突出△TAB，用EF∥TB把60°搬到T。</w:t>
+        <w:t>为什么这样想：第（1）问的构造只用到中点和全等，换成图b仍可使用。先重新列出理由，再辨认目标三角形的位置。</w:t>
       </w:r>
     </w:p>
     <w:p>
       <w:r>
         <w:drawing>
           <wp:inline xmlns:a="http://schemas.openxmlformats.org/drawingml/2006/main" xmlns:pic="http://schemas.openxmlformats.org/drawingml/2006/picture">
-            <wp:extent cx="3780000" cy="3198462"/>
+            <wp:extent cx="3888000" cy="3289846"/>
             <wp:docPr id="9" name="Picture 9"/>
             <wp:cNvGraphicFramePr>
               <a:graphicFrameLocks noChangeAspect="1"/>
@@ -744,7 +728,7 @@
               <a:graphicData uri="http://schemas.openxmlformats.org/drawingml/2006/picture">
                 <pic:pic>
                   <pic:nvPicPr>
-                    <pic:cNvPr id="0" name="h3_tab.png"/>
+                    <pic:cNvPr id="0" name="h2_sas.png"/>
                     <pic:cNvPicPr/>
                   </pic:nvPicPr>
                   <pic:blipFill>
@@ -756,7 +740,7 @@
                   <pic:spPr>
                     <a:xfrm>
                       <a:off x="0" y="0"/>
-                      <a:ext cx="3780000" cy="3198462"/>
+                      <a:ext cx="3888000" cy="3289846"/>
                     </a:xfrm>
                     <a:prstGeom prst="rect"/>
                   </pic:spPr>
@@ -769,18 +753,32 @@
     </w:p>
     <w:p>
       <w:r>
-        <w:t>EF∥TB，TA与FC同向共线，</w:t>
-        <w:br/>
-        <w:t>所以∠BTA=∠EFC=60°。</w:t>
-        <w:br/>
-        <w:t>又AT=AB，△TAB的两个底角相等，故∠TBA=60°。</w:t>
-        <w:br/>
-        <w:t>第三个角∠TAB也为60°。</w:t>
+        <w:t>看图／作图：仍延长BF过F至H，使FH=FB；连接DH、CH。</w:t>
       </w:r>
     </w:p>
     <w:p>
       <w:r>
-        <w:t>本步结论：△TAB为等边三角形，∠TAB=60°。</w:t>
+        <w:t>① AF=DF、BF=FH，且∠AFB=∠DFH。</w:t>
+        <w:br/>
+        <w:t>② △AFB≌△DFH（SAS），得DH=AB=CD。</w:t>
+        <w:br/>
+        <w:t>③ ∠ABF=∠DHF（对应角），内错角相等，故AB∥DH。</w:t>
+        <w:br/>
+        <w:t>④ 在△BHC中，E是BC中点，F是BH中点，故EF∥CH。</w:t>
+        <w:br/>
+        <w:t>⑤ M、N、E、F共线，所以MN∥CH。</w:t>
+        <w:br/>
+        <w:t>⑥ DH=CD，所以∠DHC=∠DCH。</w:t>
+      </w:r>
+    </w:p>
+    <w:p>
+      <w:r>
+        <w:t>本页结论：仍有等腰△DHC、MN∥CH、AB∥DH。</w:t>
+      </w:r>
+    </w:p>
+    <w:p>
+      <w:r>
+        <w:t>讲解提醒：O是AB与CD交点；M、N是EF分别与CD、AB的交点。不要把交点认反。</w:t>
       </w:r>
     </w:p>
     <w:p>
@@ -790,30 +788,22 @@
     </w:p>
     <w:p>
       <w:pPr>
-        <w:pStyle w:val="Title"/>
-      </w:pPr>
-      <w:r>
-        <w:t>题2（3）：末问需要新的辅助点</w:t>
-      </w:r>
-    </w:p>
-    <w:p>
-      <w:pPr>
         <w:pStyle w:val="Heading1"/>
       </w:pPr>
       <w:r>
-        <w:t>第3步：放大看△AGF，证明它是等边</w:t>
+        <w:t>第（2）问｜第2步：小三角形的底角对应哪里？</w:t>
       </w:r>
     </w:p>
     <w:p>
       <w:r>
-        <w:t>作图：放大△AGF；沿用上一步G、A、B共线，T、A、F共线的关系。</w:t>
+        <w:t>为什么这样想：原图的△OMN很小，容易看错。这里把M、N处的角拆开画，并与等腰△DHC的两个底角分别比较。</w:t>
       </w:r>
     </w:p>
     <w:p>
       <w:r>
         <w:drawing>
           <wp:inline xmlns:a="http://schemas.openxmlformats.org/drawingml/2006/main" xmlns:pic="http://schemas.openxmlformats.org/drawingml/2006/picture">
-            <wp:extent cx="3780000" cy="3198462"/>
+            <wp:extent cx="3888000" cy="3289846"/>
             <wp:docPr id="10" name="Picture 10"/>
             <wp:cNvGraphicFramePr>
               <a:graphicFrameLocks noChangeAspect="1"/>
@@ -822,7 +812,7 @@
               <a:graphicData uri="http://schemas.openxmlformats.org/drawingml/2006/picture">
                 <pic:pic>
                   <pic:nvPicPr>
-                    <pic:cNvPr id="0" name="h3_agf.png"/>
+                    <pic:cNvPr id="0" name="h2_angles.png"/>
                     <pic:cNvPicPr/>
                   </pic:nvPicPr>
                   <pic:blipFill>
@@ -834,7 +824,7 @@
                   <pic:spPr>
                     <a:xfrm>
                       <a:off x="0" y="0"/>
-                      <a:ext cx="3780000" cy="3198462"/>
+                      <a:ext cx="3888000" cy="3289846"/>
                     </a:xfrm>
                     <a:prstGeom prst="rect"/>
                   </pic:spPr>
@@ -847,18 +837,32 @@
     </w:p>
     <w:p>
       <w:r>
-        <w:t>∠GAF与∠TAB为对顶角，所以∠GAF=60°。</w:t>
-        <w:br/>
-        <w:t>FG∥TB，射线FA与TA反向、射线FG与TB反向，故∠AFG=∠BTA=60°。</w:t>
-        <w:br/>
-        <w:t>因此△AGF为等边三角形。</w:t>
-        <w:br/>
-        <w:t>AF=FD（原有中点），于是GF=AF=FD。</w:t>
+        <w:t>看图／作图：上排比较∠OMN与∠DCH；下排比较∠ONM与∠DHC。</w:t>
       </w:r>
     </w:p>
     <w:p>
       <w:r>
-        <w:t>本步结论：AG=GF=AF=FD，∠AGF=60°。</w:t>
+        <w:t>① 射线MO与CD平行且反向，MN与CH也平行且反向。</w:t>
+        <w:br/>
+        <w:t xml:space="preserve">   两条射线同时反向，故∠OMN=∠DCH。</w:t>
+        <w:br/>
+        <w:t>② 射线NO与HD平行且反向，NM与HC也平行且反向。</w:t>
+        <w:br/>
+        <w:t xml:space="preserve">   两条射线同时反向，故∠ONM=∠DHC。</w:t>
+        <w:br/>
+        <w:t>③ 等腰△DHC给出∠DCH=∠DHC。</w:t>
+        <w:br/>
+        <w:t>④ 所以∠OMN=∠ONM，即△OMN的M、N两角相等。</w:t>
+      </w:r>
+    </w:p>
+    <w:p>
+      <w:r>
+        <w:t>本页结论：相等的是M、N处的两个角；下一页由等角判断等边。</w:t>
+      </w:r>
+    </w:p>
+    <w:p>
+      <w:r>
+        <w:t>讲解提醒：这些射线方向按图b所示位置判断；角的拆图保留了原图的方向。</w:t>
       </w:r>
     </w:p>
     <w:p>
@@ -868,30 +872,22 @@
     </w:p>
     <w:p>
       <w:pPr>
-        <w:pStyle w:val="Title"/>
-      </w:pPr>
-      <w:r>
-        <w:t>题2（3）：末问需要新的辅助点</w:t>
-      </w:r>
-    </w:p>
-    <w:p>
-      <w:pPr>
         <w:pStyle w:val="Heading1"/>
       </w:pPr>
       <w:r>
-        <w:t>第4步：用120°与30°拼出直角</w:t>
+        <w:t>第（2）问｜第3步：由两个相等角，写出形状</w:t>
       </w:r>
     </w:p>
     <w:p>
       <w:r>
-        <w:t>作图：放大△AGD，突出等腰△GFD，在G处标直角。</w:t>
+        <w:t>为什么这样想：已经得到M、N处角相等，形状判断只需再用“等角对等边”。此时应单独看△OMN。</w:t>
       </w:r>
     </w:p>
     <w:p>
       <w:r>
         <w:drawing>
           <wp:inline xmlns:a="http://schemas.openxmlformats.org/drawingml/2006/main" xmlns:pic="http://schemas.openxmlformats.org/drawingml/2006/picture">
-            <wp:extent cx="3780000" cy="3198462"/>
+            <wp:extent cx="3888000" cy="3289846"/>
             <wp:docPr id="11" name="Picture 11"/>
             <wp:cNvGraphicFramePr>
               <a:graphicFrameLocks noChangeAspect="1"/>
@@ -900,7 +896,7 @@
               <a:graphicData uri="http://schemas.openxmlformats.org/drawingml/2006/picture">
                 <pic:pic>
                   <pic:nvPicPr>
-                    <pic:cNvPr id="0" name="h3_result.png"/>
+                    <pic:cNvPr id="0" name="h2_result.png"/>
                     <pic:cNvPicPr/>
                   </pic:nvPicPr>
                   <pic:blipFill>
@@ -912,7 +908,7 @@
                   <pic:spPr>
                     <a:xfrm>
                       <a:off x="0" y="0"/>
-                      <a:ext cx="3780000" cy="3198462"/>
+                      <a:ext cx="3888000" cy="3289846"/>
                     </a:xfrm>
                     <a:prstGeom prst="rect"/>
                   </pic:spPr>
@@ -925,18 +921,28 @@
     </w:p>
     <w:p>
       <w:r>
-        <w:t>FA、FD反向共线，</w:t>
-        <w:br/>
-        <w:t>∠GFD=180°-∠GFA=120°。</w:t>
-        <w:br/>
-        <w:t>GF=FD，所以∠FGD=∠FDG=30°。</w:t>
-        <w:br/>
-        <w:t>F在AD上，故∠AGD=∠AGF+∠FGD=60°+30°=90°。</w:t>
+        <w:t>看图／作图：放大△OMN，标出相等的底角及其所对的边。</w:t>
       </w:r>
     </w:p>
     <w:p>
       <w:r>
-        <w:t>本步结论：△AGD为直角三角形，∠AGD=90°，∠ADG=30°。</w:t>
+        <w:t>① ∠OMN=∠ONM（上页）。</w:t>
+        <w:br/>
+        <w:t>② ∠OMN所对的边是ON，∠ONM所对的边是OM。</w:t>
+        <w:br/>
+        <w:t>③ 在同一个三角形中，等角对等边，所以ON=OM。</w:t>
+        <w:br/>
+        <w:t>④ 故△OMN是以O为顶点、MN为底边的等腰三角形。</w:t>
+      </w:r>
+    </w:p>
+    <w:p>
+      <w:r>
+        <w:t>本页结论：△OMN是等腰三角形，OM=ON。</w:t>
+      </w:r>
+    </w:p>
+    <w:p>
+      <w:r>
+        <w:t>讲解提醒：条件不能确定O处角度；这里没有理由进一步断言它是直角三角形。</w:t>
       </w:r>
     </w:p>
     <w:p>
@@ -946,10 +952,512 @@
     </w:p>
     <w:p>
       <w:pPr>
-        <w:pStyle w:val="Title"/>
+        <w:pStyle w:val="Heading1"/>
       </w:pPr>
       <w:r>
-        <w:t>中点引理与回练</w:t>
+        <w:t>第（3）问｜第1步：辅助点T是怎样反推出来的？</w:t>
+      </w:r>
+    </w:p>
+    <w:p>
+      <w:r>
+        <w:t>为什么这样想：E是BC中点。若想让EF平行于某条新边TB，就应让F成为TC的中点。因此先反推：怎样取T才能使TF=FC？</w:t>
+      </w:r>
+    </w:p>
+    <w:p>
+      <w:r>
+        <w:drawing>
+          <wp:inline xmlns:a="http://schemas.openxmlformats.org/drawingml/2006/main" xmlns:pic="http://schemas.openxmlformats.org/drawingml/2006/picture">
+            <wp:extent cx="3888000" cy="3289846"/>
+            <wp:docPr id="12" name="Picture 12"/>
+            <wp:cNvGraphicFramePr>
+              <a:graphicFrameLocks noChangeAspect="1"/>
+            </wp:cNvGraphicFramePr>
+            <a:graphic>
+              <a:graphicData uri="http://schemas.openxmlformats.org/drawingml/2006/picture">
+                <pic:pic>
+                  <pic:nvPicPr>
+                    <pic:cNvPr id="0" name="h3_construct.png"/>
+                    <pic:cNvPicPr/>
+                  </pic:nvPicPr>
+                  <pic:blipFill>
+                    <a:blip r:embed="rId21"/>
+                    <a:stretch>
+                      <a:fillRect/>
+                    </a:stretch>
+                  </pic:blipFill>
+                  <pic:spPr>
+                    <a:xfrm>
+                      <a:off x="0" y="0"/>
+                      <a:ext cx="3888000" cy="3289846"/>
+                    </a:xfrm>
+                    <a:prstGeom prst="rect"/>
+                  </pic:spPr>
+                </pic:pic>
+              </a:graphicData>
+            </a:graphic>
+          </wp:inline>
+        </w:drawing>
+      </w:r>
+    </w:p>
+    <w:p>
+      <w:r>
+        <w:t>看图／作图：延长CA过A至T，使AT=CD（也等于AB）；本页先只看这条直线上的长度。</w:t>
+      </w:r>
+    </w:p>
+    <w:p>
+      <w:r>
+        <w:t>① A、F、D、C依次共线，AF=FD（F是AD中点）。</w:t>
+        <w:br/>
+        <w:t>② 若T放在A外侧，则TF=TA+AF，而FC=FD+DC。</w:t>
+        <w:br/>
+        <w:t>③ 因为AF=FD，只要取TA=DC，就能使上述两段相等。</w:t>
+        <w:br/>
+        <w:t>④ 因此作T，使AT=CD。再用CD=AB，得AT=AB。</w:t>
+        <w:br/>
+        <w:t>⑤ 此时T、A、F、D、C依次共线，</w:t>
+        <w:br/>
+        <w:t xml:space="preserve">   TF=TA+AF=DC+FD=FC，所以F是TC的中点。</w:t>
+      </w:r>
+    </w:p>
+    <w:p>
+      <w:r>
+        <w:t>本页结论：取T的目的：把“F是AD中点”变成“F也是TC中点”；同时得到AT=AB。</w:t>
+      </w:r>
+    </w:p>
+    <w:p>
+      <w:r>
+        <w:t>讲解提醒：T不是凭空猜出来的：先想要TF=FC，再倒推应取TA=DC。</w:t>
+      </w:r>
+    </w:p>
+    <w:p>
+      <w:r>
+        <w:br w:type="page"/>
+      </w:r>
+    </w:p>
+    <w:p>
+      <w:pPr>
+        <w:pStyle w:val="Heading1"/>
+      </w:pPr>
+      <w:r>
+        <w:t>第（3）问｜第2步：60°先使哪个三角形等边？</w:t>
+      </w:r>
+    </w:p>
+    <w:p>
+      <w:r>
+        <w:t>为什么这样想：现在E、F已成为△TBC两边的中点。先得到EF∥TB，把已知60°转移到T处；AT=AB便能接着发挥作用。</w:t>
+      </w:r>
+    </w:p>
+    <w:p>
+      <w:r>
+        <w:drawing>
+          <wp:inline xmlns:a="http://schemas.openxmlformats.org/drawingml/2006/main" xmlns:pic="http://schemas.openxmlformats.org/drawingml/2006/picture">
+            <wp:extent cx="3888000" cy="3289846"/>
+            <wp:docPr id="13" name="Picture 13"/>
+            <wp:cNvGraphicFramePr>
+              <a:graphicFrameLocks noChangeAspect="1"/>
+            </wp:cNvGraphicFramePr>
+            <a:graphic>
+              <a:graphicData uri="http://schemas.openxmlformats.org/drawingml/2006/picture">
+                <pic:pic>
+                  <pic:nvPicPr>
+                    <pic:cNvPr id="0" name="h3_tab.png"/>
+                    <pic:cNvPicPr/>
+                  </pic:nvPicPr>
+                  <pic:blipFill>
+                    <a:blip r:embed="rId22"/>
+                    <a:stretch>
+                      <a:fillRect/>
+                    </a:stretch>
+                  </pic:blipFill>
+                  <pic:spPr>
+                    <a:xfrm>
+                      <a:off x="0" y="0"/>
+                      <a:ext cx="3888000" cy="3289846"/>
+                    </a:xfrm>
+                    <a:prstGeom prst="rect"/>
+                  </pic:spPr>
+                </pic:pic>
+              </a:graphicData>
+            </a:graphic>
+          </wp:inline>
+        </w:drawing>
+      </w:r>
+    </w:p>
+    <w:p>
+      <w:r>
+        <w:t>看图／作图：连接TB，突出△TAB，标出T处与F处对应的60°。</w:t>
+      </w:r>
+    </w:p>
+    <w:p>
+      <w:r>
+        <w:t>① 在△TBC中，E是BC中点，F是TC中点，故EF∥TB。</w:t>
+        <w:br/>
+        <w:t>② 直线TC为截线，∠BTA与∠EFC为同位角。</w:t>
+        <w:br/>
+        <w:t xml:space="preserve">   因而∠BTA=∠EFC=60°。</w:t>
+        <w:br/>
+        <w:t>③ AT=AB，故△TAB中∠TBA=∠BTA=60°。</w:t>
+        <w:br/>
+        <w:t>④ 由三角形内角和，∠TAB=180°-60°-60°=60°。</w:t>
+        <w:br/>
+        <w:t>⑤ 三个角都为60°，所以△TAB是等边三角形。</w:t>
+      </w:r>
+    </w:p>
+    <w:p>
+      <w:r>
+        <w:t>本页结论：△TAB等边，∠TAB=∠BTA=∠TBA=60°，且EF∥TB。</w:t>
+      </w:r>
+    </w:p>
+    <w:p>
+      <w:r>
+        <w:t>讲解提醒：已知的60°是∠EFC；这里必须先证EF∥TB，才可以把它搬到T。</w:t>
+      </w:r>
+    </w:p>
+    <w:p>
+      <w:r>
+        <w:br w:type="page"/>
+      </w:r>
+    </w:p>
+    <w:p>
+      <w:pPr>
+        <w:pStyle w:val="Heading1"/>
+      </w:pPr>
+      <w:r>
+        <w:t>第（3）问｜第3步：A处的60°怎样得到？</w:t>
+      </w:r>
+    </w:p>
+    <w:p>
+      <w:r>
+        <w:t>为什么这样想：最终要看△AGD，而△TAB在另一侧。先利用A点两条交叉的直线，把等边△TAB的60°转到△AGF中。</w:t>
+      </w:r>
+    </w:p>
+    <w:p>
+      <w:r>
+        <w:drawing>
+          <wp:inline xmlns:a="http://schemas.openxmlformats.org/drawingml/2006/main" xmlns:pic="http://schemas.openxmlformats.org/drawingml/2006/picture">
+            <wp:extent cx="3888000" cy="3289846"/>
+            <wp:docPr id="14" name="Picture 14"/>
+            <wp:cNvGraphicFramePr>
+              <a:graphicFrameLocks noChangeAspect="1"/>
+            </wp:cNvGraphicFramePr>
+            <a:graphic>
+              <a:graphicData uri="http://schemas.openxmlformats.org/drawingml/2006/picture">
+                <pic:pic>
+                  <pic:nvPicPr>
+                    <pic:cNvPr id="0" name="h3_at_a.png"/>
+                    <pic:cNvPicPr/>
+                  </pic:nvPicPr>
+                  <pic:blipFill>
+                    <a:blip r:embed="rId23"/>
+                    <a:stretch>
+                      <a:fillRect/>
+                    </a:stretch>
+                  </pic:blipFill>
+                  <pic:spPr>
+                    <a:xfrm>
+                      <a:off x="0" y="0"/>
+                      <a:ext cx="3888000" cy="3289846"/>
+                    </a:xfrm>
+                    <a:prstGeom prst="rect"/>
+                  </pic:spPr>
+                </pic:pic>
+              </a:graphicData>
+            </a:graphic>
+          </wp:inline>
+        </w:drawing>
+      </w:r>
+    </w:p>
+    <w:p>
+      <w:r>
+        <w:t>看图／作图：单独画出G—A—B与T—A—F两条相交直线；同色弧标出一对对顶角。</w:t>
+      </w:r>
+    </w:p>
+    <w:p>
+      <w:r>
+        <w:t>① G在BA越过A的延长线上，所以G、A、B依次共线。</w:t>
+        <w:br/>
+        <w:t>② T在CA越过A的延长线上，且F在AC上，所以T、A、F依次共线。</w:t>
+        <w:br/>
+        <w:t>③ 因而射线AG与AB反向，射线AF与AT反向。</w:t>
+        <w:br/>
+        <w:t>④ ∠GAF与∠TAB是一对对顶角，大小相等。</w:t>
+        <w:br/>
+        <w:t>⑤ 上页得到∠TAB=60°，故∠GAF=60°。</w:t>
+      </w:r>
+    </w:p>
+    <w:p>
+      <w:r>
+        <w:t>本页结论：△AGF在A处的角为60°；还需再确定它的另一个角。</w:t>
+      </w:r>
+    </w:p>
+    <w:p>
+      <w:r>
+        <w:t>讲解提醒：请先在图上指出组成∠TAB的两条射线，再找各自的反向射线。</w:t>
+      </w:r>
+    </w:p>
+    <w:p>
+      <w:r>
+        <w:br w:type="page"/>
+      </w:r>
+    </w:p>
+    <w:p>
+      <w:pPr>
+        <w:pStyle w:val="Heading1"/>
+      </w:pPr>
+      <w:r>
+        <w:t>第（3）问｜第4步：F处再得60°，得到第二个等边三角形</w:t>
+      </w:r>
+    </w:p>
+    <w:p>
+      <w:r>
+        <w:t>为什么这样想：只知道一个60°还不能认定等边。利用GF所在直线与TB平行，再得到F处的60°，才能推出GF=AF。</w:t>
+      </w:r>
+    </w:p>
+    <w:p>
+      <w:r>
+        <w:drawing>
+          <wp:inline xmlns:a="http://schemas.openxmlformats.org/drawingml/2006/main" xmlns:pic="http://schemas.openxmlformats.org/drawingml/2006/picture">
+            <wp:extent cx="3888000" cy="3289846"/>
+            <wp:docPr id="15" name="Picture 15"/>
+            <wp:cNvGraphicFramePr>
+              <a:graphicFrameLocks noChangeAspect="1"/>
+            </wp:cNvGraphicFramePr>
+            <a:graphic>
+              <a:graphicData uri="http://schemas.openxmlformats.org/drawingml/2006/picture">
+                <pic:pic>
+                  <pic:nvPicPr>
+                    <pic:cNvPr id="0" name="h3_at_f.png"/>
+                    <pic:cNvPicPr/>
+                  </pic:nvPicPr>
+                  <pic:blipFill>
+                    <a:blip r:embed="rId24"/>
+                    <a:stretch>
+                      <a:fillRect/>
+                    </a:stretch>
+                  </pic:blipFill>
+                  <pic:spPr>
+                    <a:xfrm>
+                      <a:off x="0" y="0"/>
+                      <a:ext cx="3888000" cy="3289846"/>
+                    </a:xfrm>
+                    <a:prstGeom prst="rect"/>
+                  </pic:spPr>
+                </pic:pic>
+              </a:graphicData>
+            </a:graphic>
+          </wp:inline>
+        </w:drawing>
+      </w:r>
+    </w:p>
+    <w:p>
+      <w:r>
+        <w:t>看图／作图：突出平行的TB、FG，以及截线TC；比较T处和F处的一组内错角。</w:t>
+      </w:r>
+    </w:p>
+    <w:p>
+      <w:r>
+        <w:t>① G、F、E共线，且EF∥TB，所以FG∥TB。</w:t>
+        <w:br/>
+        <w:t>② 直线TC截平行线TB、FG，∠BTA与∠AFG是一组内错角。</w:t>
+        <w:br/>
+        <w:t xml:space="preserve">   因而∠AFG=∠BTA=60°。</w:t>
+        <w:br/>
+        <w:t>③ 上页已得∠GAF=60°，所以∠AGF=180°-60°-60°=60°。</w:t>
+        <w:br/>
+        <w:t>④ △AGF三个角均为60°，故为等边三角形，AG=GF=AF。</w:t>
+        <w:br/>
+        <w:t>⑤ 原题F是AD中点，AF=FD，所以GF=FD。</w:t>
+      </w:r>
+    </w:p>
+    <w:p>
+      <w:r>
+        <w:t>本页结论：△AGF等边；尤其GF=AF=FD，这是下一步判断等腰的依据。</w:t>
+      </w:r>
+    </w:p>
+    <w:p>
+      <w:r>
+        <w:t>讲解提醒：F处的60°是∠AFG；相邻的∠GFD还没有算，它不是60°。</w:t>
+      </w:r>
+    </w:p>
+    <w:p>
+      <w:r>
+        <w:br w:type="page"/>
+      </w:r>
+    </w:p>
+    <w:p>
+      <w:pPr>
+        <w:pStyle w:val="Heading1"/>
+      </w:pPr>
+      <w:r>
+        <w:t>第（3）问｜第5步：为什么会出现120°和30°？</w:t>
+      </w:r>
+    </w:p>
+    <w:p>
+      <w:r>
+        <w:t>为什么这样想：F在AD上，FA与FD方向相反。因此等边△AGF的60°旁边，恰好是一个120°；再利用GF=FD求出两个底角。</w:t>
+      </w:r>
+    </w:p>
+    <w:p>
+      <w:r>
+        <w:drawing>
+          <wp:inline xmlns:a="http://schemas.openxmlformats.org/drawingml/2006/main" xmlns:pic="http://schemas.openxmlformats.org/drawingml/2006/picture">
+            <wp:extent cx="3888000" cy="3289846"/>
+            <wp:docPr id="16" name="Picture 16"/>
+            <wp:cNvGraphicFramePr>
+              <a:graphicFrameLocks noChangeAspect="1"/>
+            </wp:cNvGraphicFramePr>
+            <a:graphic>
+              <a:graphicData uri="http://schemas.openxmlformats.org/drawingml/2006/picture">
+                <pic:pic>
+                  <pic:nvPicPr>
+                    <pic:cNvPr id="0" name="h3_gfd.png"/>
+                    <pic:cNvPicPr/>
+                  </pic:nvPicPr>
+                  <pic:blipFill>
+                    <a:blip r:embed="rId25"/>
+                    <a:stretch>
+                      <a:fillRect/>
+                    </a:stretch>
+                  </pic:blipFill>
+                  <pic:spPr>
+                    <a:xfrm>
+                      <a:off x="0" y="0"/>
+                      <a:ext cx="3888000" cy="3289846"/>
+                    </a:xfrm>
+                    <a:prstGeom prst="rect"/>
+                  </pic:spPr>
+                </pic:pic>
+              </a:graphicData>
+            </a:graphic>
+          </wp:inline>
+        </w:drawing>
+      </w:r>
+    </w:p>
+    <w:p>
+      <w:r>
+        <w:t>看图／作图：单独放大△GFD，保留A以便看清FA、FD是两条反向射线。</w:t>
+      </w:r>
+    </w:p>
+    <w:p>
+      <w:r>
+        <w:t>① A、F、D依次共线，故∠GFA+∠GFD=180°（平角）。</w:t>
+        <w:br/>
+        <w:t>② △AGF等边，∠GFA=60°，所以∠GFD=120°。</w:t>
+        <w:br/>
+        <w:t>③ 上页GF=FD，故△GFD是等腰三角形，顶点为F。</w:t>
+        <w:br/>
+        <w:t>④ ∠FGD=∠FDG=(180°-120°)÷2=30°。</w:t>
+        <w:br/>
+        <w:t>⑤ A、F均在D的同侧，且三点共线，所以射线DF与DA重合，</w:t>
+        <w:br/>
+        <w:t xml:space="preserve">   因而∠ADG=∠FDG=30°。</w:t>
+      </w:r>
+    </w:p>
+    <w:p>
+      <w:r>
+        <w:t>本页结论：△GFD中：F处120°，G、D处各30°；△AGD在D处也是30°。</w:t>
+      </w:r>
+    </w:p>
+    <w:p>
+      <w:r>
+        <w:t>讲解提醒：相等边GF、FD的公共端点是F，所以120°是顶角，两个30°是底角。</w:t>
+      </w:r>
+    </w:p>
+    <w:p>
+      <w:r>
+        <w:br w:type="page"/>
+      </w:r>
+    </w:p>
+    <w:p>
+      <w:pPr>
+        <w:pStyle w:val="Heading1"/>
+      </w:pPr>
+      <w:r>
+        <w:t>第（3）问｜第6步：哪个角是直角？把它拼出来</w:t>
+      </w:r>
+    </w:p>
+    <w:p>
+      <w:r>
+        <w:t>为什么这样想：要求判断的是△AGD。前面得到的等边△AGF、等腰△GFD只是中间结构，最后必须回到G点把相邻的两个角相加。</w:t>
+      </w:r>
+    </w:p>
+    <w:p>
+      <w:r>
+        <w:drawing>
+          <wp:inline xmlns:a="http://schemas.openxmlformats.org/drawingml/2006/main" xmlns:pic="http://schemas.openxmlformats.org/drawingml/2006/picture">
+            <wp:extent cx="3888000" cy="3289846"/>
+            <wp:docPr id="17" name="Picture 17"/>
+            <wp:cNvGraphicFramePr>
+              <a:graphicFrameLocks noChangeAspect="1"/>
+            </wp:cNvGraphicFramePr>
+            <a:graphic>
+              <a:graphicData uri="http://schemas.openxmlformats.org/drawingml/2006/picture">
+                <pic:pic>
+                  <pic:nvPicPr>
+                    <pic:cNvPr id="0" name="h3_final.png"/>
+                    <pic:cNvPicPr/>
+                  </pic:nvPicPr>
+                  <pic:blipFill>
+                    <a:blip r:embed="rId26"/>
+                    <a:stretch>
+                      <a:fillRect/>
+                    </a:stretch>
+                  </pic:blipFill>
+                  <pic:spPr>
+                    <a:xfrm>
+                      <a:off x="0" y="0"/>
+                      <a:ext cx="3888000" cy="3289846"/>
+                    </a:xfrm>
+                    <a:prstGeom prst="rect"/>
+                  </pic:spPr>
+                </pic:pic>
+              </a:graphicData>
+            </a:graphic>
+          </wp:inline>
+        </w:drawing>
+      </w:r>
+    </w:p>
+    <w:p>
+      <w:r>
+        <w:t>看图／作图：突出整个△AGD，用GF把G处的角分成60°与30°两部分，再标出总直角。</w:t>
+      </w:r>
+    </w:p>
+    <w:p>
+      <w:r>
+        <w:t>① 在△AGF中，∠AGF=60°；在△GFD中，∠FGD=30°。</w:t>
+        <w:br/>
+        <w:t>② F在线段AD上，所以射线GF在∠AGD内部。</w:t>
+        <w:br/>
+        <w:t>③ ∠AGD=∠AGF+∠FGD=60°+30°=90°。</w:t>
+        <w:br/>
+        <w:t>④ 因而△AGD是直角三角形，直角顶点为G。</w:t>
+        <w:br/>
+        <w:t>⑤ 另有∠ADG=30°、∠GAD=60°。</w:t>
+        <w:br/>
+        <w:t>⑥ 还可由AD=AF+FD=2AF=2AG，得到AD=2AG。</w:t>
+      </w:r>
+    </w:p>
+    <w:p>
+      <w:r>
+        <w:t>本页结论：最终答案：△AGD是直角三角形，∠AGD=90°，∠ADG=30°。</w:t>
+      </w:r>
+    </w:p>
+    <w:p>
+      <w:r>
+        <w:t>讲解提醒：不要把两个中间结论混起来：△AGF等边、△GFD等腰、△AGD直角。</w:t>
+      </w:r>
+    </w:p>
+    <w:p>
+      <w:r>
+        <w:br w:type="page"/>
+      </w:r>
+    </w:p>
+    <w:p>
+      <w:pPr>
+        <w:pStyle w:val="Heading1"/>
+      </w:pPr>
+      <w:r>
+        <w:t>三问复盘与教师追问</w:t>
       </w:r>
     </w:p>
     <w:p>
@@ -957,12 +1465,12 @@
         <w:pStyle w:val="Heading2"/>
       </w:pPr>
       <w:r>
-        <w:t>中点连线平行性质：只用两次SAS</w:t>
+        <w:t>第（1）问：从全等到等角</w:t>
       </w:r>
     </w:p>
     <w:p>
       <w:r>
-        <w:t>△TUV中，X、Y分别为TU、TV中点。延长XY至Z，使YZ=YX。由TY=YV、YX=YZ和对顶角，△TYX≌△VYZ（SAS），所以VZ=TX=UX，VZ∥UX。连接UZ。由UX=VZ、UZ公共和内错角，△XUZ≌△VZU（SAS），得XZ=VU，XZ∥VU，进而XY∥UV。所配逐步图见原教师图解附录（链接在README），可在课前补讲。</w:t>
+        <w:t>倍长BF至H → △AFB≌△DFH → DH=CD且AB∥DH → 在△BHC中得EF∥CH → △DHC等腰 → 分别对应M、N处的角 → ∠BME=∠CNE。</w:t>
       </w:r>
     </w:p>
     <w:p>
@@ -970,18 +1478,12 @@
         <w:pStyle w:val="Heading2"/>
       </w:pPr>
       <w:r>
-        <w:t>末问必须讲透的四个问题</w:t>
+        <w:t>第（2）问：同一构造，重新辨认角</w:t>
       </w:r>
     </w:p>
     <w:p>
       <w:r>
-        <w:t>①为什么在CA越过A的方向取T，而不是在AC越过C的方向？</w:t>
-        <w:br/>
-        <w:t>②怎样从AT=CD和AF=FD推出TF=FC？</w:t>
-        <w:br/>
-        <w:t>③哪一步用到了∠EFC=60°？</w:t>
-        <w:br/>
-        <w:t>④为什么最后答案是G处直角，而不是把△AGD直接认成等边？</w:t>
+        <w:t>仍倍长BF至H → DH=CD、AB∥DH、MN∥CH → ∠OMN=∠DCH、∠ONM=∠DHC → M、N两角相等 → OM=ON。只能确定等腰。</w:t>
       </w:r>
     </w:p>
     <w:p>
@@ -989,12 +1491,12 @@
         <w:pStyle w:val="Heading2"/>
       </w:pPr>
       <w:r>
-        <w:t>即时回练，不另编题</w:t>
+        <w:t>第（3）问：三个三角形，各有不同作用</w:t>
       </w:r>
     </w:p>
     <w:p>
       <w:r>
-        <w:t>遮住教师答案，让学生只看图c，重新构造T、证明F是TC中点，并口述从平行线到60°、120°、30°、90°的完整链条。若讲解后能重建，记录为即时掌握；下一课还需陌生同型题检查迁移。</w:t>
+        <w:t>反推TF=FC，取TA=DC → EF∥TB → △TAB等边 → 对顶角和内错角使△AGF等边 → GF=AF=FD → △GFD等腰，得120°及两个30° → 在G处相加60°+30°，所以△AGD直角。</w:t>
       </w:r>
     </w:p>
     <w:p>
@@ -1002,18 +1504,31 @@
         <w:pStyle w:val="Heading2"/>
       </w:pPr>
       <w:r>
-        <w:t>提示等级与记录</w:t>
+        <w:t>教师追问及可核对的回答</w:t>
       </w:r>
     </w:p>
     <w:p>
       <w:r>
-        <w:t>题1独立用时____分钟，____/12；题2____分钟，____/24。</w:t>
+        <w:t>问：为什么T在A外侧？答：这样TF=TA+AF，能与FC=FD+DC逐项比较，取TA=DC即可。</w:t>
         <w:br/>
-        <w:t>辅助线：□独立想到 □口头方向 □给出辅助点 □完整示范。</w:t>
+        <w:t>问：为何不能见60°就认等边？答：必须再用等腰条件或求出第二个60°。</w:t>
         <w:br/>
-        <w:t>中点性质：□已掌握 □需补讲。</w:t>
+        <w:t>问：GF=FD从哪来？答：△AGF等边给GF=AF，原中点给AF=FD。</w:t>
         <w:br/>
-        <w:t>末问卡在：□构造T □证明中点 □角度迁移 □特殊三角形 □合并角度。</w:t>
+        <w:t>问：直角在哪里？答：G处，因为∠AGD=∠AGF+∠FGD=60°+30°。</w:t>
+      </w:r>
+    </w:p>
+    <w:p>
+      <w:pPr>
+        <w:pStyle w:val="Heading2"/>
+      </w:pPr>
+      <w:r>
+        <w:t>讲课时的用法</w:t>
+      </w:r>
+    </w:p>
+    <w:p>
+      <w:r>
+        <w:t>先让学生在原图上指出对应的三角形、边、角，再展示下一页。讲后遮住详解，要求学生重画H或T并复述每一个等号的理由。已经会的页可以跳过，无须把整份详解当作逐字朗读稿。</w:t>
       </w:r>
     </w:p>
     <w:sectPr>
@@ -1034,7 +1549,7 @@
       <w:pStyle w:val="Footer"/>
     </w:pPr>
     <w:r>
-      <w:t>逐步配图教师答案｜2026-10-17｜出处与编排说明见README</w:t>
+      <w:t>详解修订版｜2026-10-17｜出处与编排说明见README</w:t>
     </w:r>
   </w:p>
 </w:ftr>
@@ -1404,7 +1919,7 @@
     <w:qFormat/>
     <w:rsid w:val="00FC693F"/>
     <w:pPr>
-      <w:spacing w:after="120"/>
+      <w:spacing w:after="80" w:line="269" w:lineRule="auto"/>
     </w:pPr>
     <w:rPr>
       <w:rFonts w:ascii="宋体" w:hAnsi="宋体" w:eastAsia="宋体"/>

</xml_diff>